<commit_message>
Corrected docx also reports variance-explained on random-intercept basis
fill_wps_tables_docx_corrected.py now reads sigma2_u0_ri / delta_pct_ri (M2/M3),
so the corrected shell matches the augmented table: Violations 19.2% / 38.4%,
Inspections 10.6% / 6.4% -- no more -12.5%. Also fixes a latent placeholder-count
break now that M1 carries sigma2/delta_pct in the JSON.

Co-Authored-By: Claude Opus 4.8 (1M context) <noreply@anthropic.com>
</commit_message>
<xml_diff>
--- a/docs/WPS_Table_Sheels_filled_corrected.docx
+++ b/docs/WPS_Table_Sheels_filled_corrected.docx
@@ -1537,7 +1537,7 @@
           </w:tcPr>
           <w:p>
             <w:r>
-              <w:t>0.612</w:t>
+              <w:t>0.525</w:t>
             </w:r>
           </w:p>
         </w:tc>
@@ -1561,7 +1561,7 @@
           </w:tcPr>
           <w:p>
             <w:r>
-              <w:t>0.630</w:t>
+              <w:t>0.550</w:t>
             </w:r>
           </w:p>
         </w:tc>
@@ -1652,7 +1652,7 @@
           </w:tcPr>
           <w:p>
             <w:r>
-              <w:t>7.3%</w:t>
+              <w:t>10.6%</w:t>
             </w:r>
           </w:p>
         </w:tc>
@@ -1676,7 +1676,7 @@
           </w:tcPr>
           <w:p>
             <w:r>
-              <w:t>4.6%</w:t>
+              <w:t>6.4%</w:t>
             </w:r>
           </w:p>
         </w:tc>
@@ -3484,7 +3484,7 @@
           </w:tcPr>
           <w:p>
             <w:r>
-              <w:t>0.715</w:t>
+              <w:t>0.434</w:t>
             </w:r>
           </w:p>
         </w:tc>
@@ -3508,7 +3508,7 @@
           </w:tcPr>
           <w:p>
             <w:r>
-              <w:t>0.402</w:t>
+              <w:t>0.331</w:t>
             </w:r>
           </w:p>
         </w:tc>
@@ -3589,7 +3589,7 @@
           </w:tcPr>
           <w:p>
             <w:r>
-              <w:t>-12.5%</w:t>
+              <w:t>19.2%</w:t>
             </w:r>
           </w:p>
         </w:tc>
@@ -3613,7 +3613,7 @@
           </w:tcPr>
           <w:p>
             <w:r>
-              <w:t>36.8%</w:t>
+              <w:t>38.4%</w:t>
             </w:r>
           </w:p>
         </w:tc>
@@ -3823,7 +3823,7 @@
         <w:t xml:space="preserve">Note on model specification (2026-07 revision). </w:t>
       </w:r>
       <w:r>
-        <w:t>Both outcomes are modelled as log(count + 1); the violations model includes log(inspections + 1) as a contemporaneous predictor on the same scale. Spending/applicator and Spending/farmworker use mean 2011-2019 STAG obligations over mean 2011-2019 BLS employment in the respective occupation; six states (Hawaii, Mississippi, Rhode Island, Tennessee, Utah, West Virginia) received no obligations under the pesticide-enforcement program (CFDA 66.700) in the study window and are coded $0. The H-2A-to-farmworker ratio is matched by year (annual certified H-2A workers over annual BLS farmworkers). The substantive models are estimated on 47 states: Alaska, Rhode Island, and Vermont are omitted from Spending/applicator columns because BLS never publishes pesticide-applicator (SOC 37-3012) employment for them. Standard errors in parentheses; + p&lt;.10, * p&lt;.05, ** p&lt;.01, *** p&lt;.001. Δ State-to-State σ² is the reduction in between-state intercept variance relative to a time-only baseline re-estimated on each column’s analytic sample.</w:t>
+        <w:t>Both outcomes are modelled as log(count + 1); the violations model includes log(inspections + 1) as a contemporaneous predictor on the same scale. Spending/applicator and Spending/farmworker use mean 2011-2019 STAG obligations over mean 2011-2019 BLS employment in the respective occupation; six states (Hawaii, Mississippi, Rhode Island, Tennessee, Utah, West Virginia) received no obligations under the pesticide-enforcement program (CFDA 66.700) in the study window and are coded $0. The H-2A-to-farmworker ratio is matched by year (annual certified H-2A workers over annual BLS farmworkers). The substantive models are estimated on 47 states: Alaska, Rhode Island, and Vermont are omitted from Spending/applicator columns because BLS never publishes pesticide-applicator (SOC 37-3012) employment for them. Standard errors in parentheses; + p&lt;.10, * p&lt;.05, ** p&lt;.01, *** p&lt;.001. State-to-State σ² and Δ State-to-State σ² are read from random-intercept-only refits (baseline and model, same sample): Δ is the percent of between-state intercept variance explained. Coefficients come from the random-slope specification; the random-intercept basis is used for the variance-explained statistic because in the random-slope model σ² is centered at 2017 and its reduction is not bounded to [0,1].</w:t>
       </w:r>
     </w:p>
     <w:sectPr>

</xml_diff>